<commit_message>
Review, rename, and edit diagrams
</commit_message>
<xml_diff>
--- a/docs/Exception-Failure-Path.docx
+++ b/docs/Exception-Failure-Path.docx
@@ -5,12 +5,14 @@
     <w:p>
       <w:pPr>
         <w:rPr>
+          <w:rFonts w:ascii="Times New Roman" w:hAnsi="Times New Roman" w:cs="Times New Roman"/>
           <w:b/>
           <w:bCs/>
         </w:rPr>
       </w:pPr>
       <w:r>
         <w:rPr>
+          <w:rFonts w:ascii="Times New Roman" w:hAnsi="Times New Roman" w:cs="Times New Roman"/>
           <w:b/>
           <w:bCs/>
         </w:rPr>
@@ -18,7 +20,15 @@
       </w:r>
     </w:p>
     <w:p>
+      <w:pPr>
+        <w:rPr>
+          <w:rFonts w:ascii="Times New Roman" w:hAnsi="Times New Roman" w:cs="Times New Roman"/>
+        </w:rPr>
+      </w:pPr>
       <w:r>
+        <w:rPr>
+          <w:rFonts w:ascii="Times New Roman" w:hAnsi="Times New Roman" w:cs="Times New Roman"/>
+        </w:rPr>
         <w:t>Employee receiving request declines the request</w:t>
       </w:r>
     </w:p>
@@ -29,8 +39,14 @@
           <w:ilvl w:val="0"/>
           <w:numId w:val="1"/>
         </w:numPr>
+        <w:rPr>
+          <w:rFonts w:ascii="Times New Roman" w:hAnsi="Times New Roman" w:cs="Times New Roman"/>
+        </w:rPr>
       </w:pPr>
       <w:r>
+        <w:rPr>
+          <w:rFonts w:ascii="Times New Roman" w:hAnsi="Times New Roman" w:cs="Times New Roman"/>
+        </w:rPr>
         <w:t>The request is submitted by the initiating employee</w:t>
       </w:r>
     </w:p>
@@ -41,8 +57,14 @@
           <w:ilvl w:val="0"/>
           <w:numId w:val="1"/>
         </w:numPr>
+        <w:rPr>
+          <w:rFonts w:ascii="Times New Roman" w:hAnsi="Times New Roman" w:cs="Times New Roman"/>
+        </w:rPr>
       </w:pPr>
       <w:r>
+        <w:rPr>
+          <w:rFonts w:ascii="Times New Roman" w:hAnsi="Times New Roman" w:cs="Times New Roman"/>
+        </w:rPr>
         <w:t>The system routes the request to the receiving employee</w:t>
       </w:r>
     </w:p>
@@ -53,8 +75,14 @@
           <w:ilvl w:val="0"/>
           <w:numId w:val="1"/>
         </w:numPr>
+        <w:rPr>
+          <w:rFonts w:ascii="Times New Roman" w:hAnsi="Times New Roman" w:cs="Times New Roman"/>
+        </w:rPr>
       </w:pPr>
       <w:r>
+        <w:rPr>
+          <w:rFonts w:ascii="Times New Roman" w:hAnsi="Times New Roman" w:cs="Times New Roman"/>
+        </w:rPr>
         <w:t>The request changes to PENDING while the receiving employee reviews</w:t>
       </w:r>
     </w:p>
@@ -65,8 +93,14 @@
           <w:ilvl w:val="0"/>
           <w:numId w:val="1"/>
         </w:numPr>
+        <w:rPr>
+          <w:rFonts w:ascii="Times New Roman" w:hAnsi="Times New Roman" w:cs="Times New Roman"/>
+        </w:rPr>
       </w:pPr>
       <w:r>
+        <w:rPr>
+          <w:rFonts w:ascii="Times New Roman" w:hAnsi="Times New Roman" w:cs="Times New Roman"/>
+        </w:rPr>
         <w:t>The receiving employee declines the shift swap request</w:t>
       </w:r>
     </w:p>
@@ -77,8 +111,14 @@
           <w:ilvl w:val="0"/>
           <w:numId w:val="1"/>
         </w:numPr>
+        <w:rPr>
+          <w:rFonts w:ascii="Times New Roman" w:hAnsi="Times New Roman" w:cs="Times New Roman"/>
+        </w:rPr>
       </w:pPr>
       <w:r>
+        <w:rPr>
+          <w:rFonts w:ascii="Times New Roman" w:hAnsi="Times New Roman" w:cs="Times New Roman"/>
+        </w:rPr>
         <w:t xml:space="preserve">The system records the decline and reason for decline </w:t>
       </w:r>
     </w:p>
@@ -89,8 +129,14 @@
           <w:ilvl w:val="0"/>
           <w:numId w:val="1"/>
         </w:numPr>
+        <w:rPr>
+          <w:rFonts w:ascii="Times New Roman" w:hAnsi="Times New Roman" w:cs="Times New Roman"/>
+        </w:rPr>
       </w:pPr>
       <w:r>
+        <w:rPr>
+          <w:rFonts w:ascii="Times New Roman" w:hAnsi="Times New Roman" w:cs="Times New Roman"/>
+        </w:rPr>
         <w:t>The request status is changed from PENDING to DENIED</w:t>
       </w:r>
     </w:p>
@@ -101,8 +147,14 @@
           <w:ilvl w:val="0"/>
           <w:numId w:val="1"/>
         </w:numPr>
+        <w:rPr>
+          <w:rFonts w:ascii="Times New Roman" w:hAnsi="Times New Roman" w:cs="Times New Roman"/>
+        </w:rPr>
       </w:pPr>
       <w:r>
+        <w:rPr>
+          <w:rFonts w:ascii="Times New Roman" w:hAnsi="Times New Roman" w:cs="Times New Roman"/>
+        </w:rPr>
         <w:t>The request does not continue to manager approval stage</w:t>
       </w:r>
     </w:p>
@@ -113,36 +165,102 @@
           <w:ilvl w:val="0"/>
           <w:numId w:val="1"/>
         </w:numPr>
+        <w:rPr>
+          <w:rFonts w:ascii="Times New Roman" w:hAnsi="Times New Roman" w:cs="Times New Roman"/>
+        </w:rPr>
       </w:pPr>
       <w:r>
+        <w:rPr>
+          <w:rFonts w:ascii="Times New Roman" w:hAnsi="Times New Roman" w:cs="Times New Roman"/>
+        </w:rPr>
         <w:t>The schedule is not altered for either employee</w:t>
       </w:r>
     </w:p>
     <w:p>
       <w:pPr>
         <w:ind w:left="360"/>
+        <w:rPr>
+          <w:rFonts w:ascii="Times New Roman" w:hAnsi="Times New Roman" w:cs="Times New Roman"/>
+        </w:rPr>
       </w:pPr>
       <w:r>
+        <w:rPr>
+          <w:rFonts w:ascii="Times New Roman" w:hAnsi="Times New Roman" w:cs="Times New Roman"/>
+        </w:rPr>
         <w:t>Pending &gt; Receiving employee reviews request &gt; Declines &gt; DENIED</w:t>
       </w:r>
     </w:p>
     <w:p>
       <w:pPr>
         <w:ind w:left="360"/>
+        <w:rPr>
+          <w:rFonts w:ascii="Times New Roman" w:hAnsi="Times New Roman" w:cs="Times New Roman"/>
+        </w:rPr>
       </w:pPr>
       <w:r>
+        <w:rPr>
+          <w:rFonts w:ascii="Times New Roman" w:hAnsi="Times New Roman" w:cs="Times New Roman"/>
+        </w:rPr>
         <w:t>Result:</w:t>
       </w:r>
     </w:p>
     <w:p>
       <w:pPr>
         <w:ind w:left="360"/>
+        <w:rPr>
+          <w:rFonts w:ascii="Times New Roman" w:hAnsi="Times New Roman" w:cs="Times New Roman"/>
+        </w:rPr>
       </w:pPr>
       <w:r>
-        <w:t xml:space="preserve">The request ends, decline and reason is recorded, no manager approval is needed and schedules remain unchanged.  </w:t>
+        <w:rPr>
+          <w:rFonts w:ascii="Times New Roman" w:hAnsi="Times New Roman" w:cs="Times New Roman"/>
+        </w:rPr>
+        <w:t xml:space="preserve">The request ends, </w:t>
+      </w:r>
+      <w:r>
+        <w:rPr>
+          <w:rFonts w:ascii="Times New Roman" w:hAnsi="Times New Roman" w:cs="Times New Roman"/>
+        </w:rPr>
+        <w:t xml:space="preserve">the </w:t>
+      </w:r>
+      <w:r>
+        <w:rPr>
+          <w:rFonts w:ascii="Times New Roman" w:hAnsi="Times New Roman" w:cs="Times New Roman"/>
+        </w:rPr>
+        <w:t xml:space="preserve">decline and </w:t>
+      </w:r>
+      <w:r>
+        <w:rPr>
+          <w:rFonts w:ascii="Times New Roman" w:hAnsi="Times New Roman" w:cs="Times New Roman"/>
+        </w:rPr>
+        <w:t xml:space="preserve">its </w:t>
+      </w:r>
+      <w:r>
+        <w:rPr>
+          <w:rFonts w:ascii="Times New Roman" w:hAnsi="Times New Roman" w:cs="Times New Roman"/>
+        </w:rPr>
+        <w:t xml:space="preserve">reason </w:t>
+      </w:r>
+      <w:r>
+        <w:rPr>
+          <w:rFonts w:ascii="Times New Roman" w:hAnsi="Times New Roman" w:cs="Times New Roman"/>
+        </w:rPr>
+        <w:t>are</w:t>
+      </w:r>
+      <w:r>
+        <w:rPr>
+          <w:rFonts w:ascii="Times New Roman" w:hAnsi="Times New Roman" w:cs="Times New Roman"/>
+        </w:rPr>
+        <w:t xml:space="preserve"> recorded, no manager approval is needed and schedules remain unchanged.  </w:t>
       </w:r>
     </w:p>
-    <w:p/>
+    <w:p>
+      <w:pPr>
+        <w:rPr>
+          <w:rFonts w:ascii="Times New Roman" w:hAnsi="Times New Roman" w:cs="Times New Roman"/>
+        </w:rPr>
+      </w:pPr>
+    </w:p>
     <w:sectPr>
       <w:pgSz w:w="12240" w:h="15840"/>
       <w:pgMar w:top="1440" w:right="1440" w:bottom="1440" w:left="1440" w:header="720" w:footer="720" w:gutter="0"/>
@@ -1486,6 +1604,14 @@
 </file>
 
 <file path=customXml/item1.xml><?xml version="1.0" encoding="utf-8"?>
+<p:properties xmlns:p="http://schemas.microsoft.com/office/2006/metadata/properties" xmlns:xsi="http://www.w3.org/2001/XMLSchema-instance" xmlns:pc="http://schemas.microsoft.com/office/infopath/2007/PartnerControls">
+  <documentManagement>
+    <_activity xmlns="642d3e23-7199-4480-be53-2cfe8a95b7e5" xsi:nil="true"/>
+  </documentManagement>
+</p:properties>
+</file>
+
+<file path=customXml/item2.xml><?xml version="1.0" encoding="utf-8"?>
 <?mso-contentType ?>
 <FormTemplates xmlns="http://schemas.microsoft.com/sharepoint/v3/contenttype/forms">
   <Display>DocumentLibraryForm</Display>
@@ -1494,7 +1620,7 @@
 </FormTemplates>
 </file>
 
-<file path=customXml/item2.xml><?xml version="1.0" encoding="utf-8"?>
+<file path=customXml/item3.xml><?xml version="1.0" encoding="utf-8"?>
 <ct:contentTypeSchema xmlns:ct="http://schemas.microsoft.com/office/2006/metadata/contentType" xmlns:ma="http://schemas.microsoft.com/office/2006/metadata/properties/metaAttributes" ct:_="" ma:_="" ma:contentTypeName="Document" ma:contentTypeID="0x0101002288718BDF396E4CADB8EEAA4ECB8641" ma:contentTypeVersion="5" ma:contentTypeDescription="Create a new document." ma:contentTypeScope="" ma:versionID="67e0a50dece69fa1c229f92493710384">
   <xsd:schema xmlns:xsd="http://www.w3.org/2001/XMLSchema" xmlns:xs="http://www.w3.org/2001/XMLSchema" xmlns:p="http://schemas.microsoft.com/office/2006/metadata/properties" xmlns:ns3="642d3e23-7199-4480-be53-2cfe8a95b7e5" targetNamespace="http://schemas.microsoft.com/office/2006/metadata/properties" ma:root="true" ma:fieldsID="593cb92b5030c0be7a0d8d0f925a46cb" ns3:_="">
     <xsd:import namespace="642d3e23-7199-4480-be53-2cfe8a95b7e5"/>
@@ -1644,15 +1770,17 @@
 </ct:contentTypeSchema>
 </file>
 
-<file path=customXml/item3.xml><?xml version="1.0" encoding="utf-8"?>
-<p:properties xmlns:p="http://schemas.microsoft.com/office/2006/metadata/properties" xmlns:xsi="http://www.w3.org/2001/XMLSchema-instance" xmlns:pc="http://schemas.microsoft.com/office/infopath/2007/PartnerControls">
-  <documentManagement>
-    <_activity xmlns="642d3e23-7199-4480-be53-2cfe8a95b7e5" xsi:nil="true"/>
-  </documentManagement>
-</p:properties>
+<file path=customXml/itemProps1.xml><?xml version="1.0" encoding="utf-8"?>
+<ds:datastoreItem xmlns:ds="http://schemas.openxmlformats.org/officeDocument/2006/customXml" ds:itemID="{29C4C59C-B683-41B1-841F-F70D1B5C7758}">
+  <ds:schemaRefs>
+    <ds:schemaRef ds:uri="http://schemas.microsoft.com/office/2006/metadata/properties"/>
+    <ds:schemaRef ds:uri="http://schemas.microsoft.com/office/infopath/2007/PartnerControls"/>
+    <ds:schemaRef ds:uri="642d3e23-7199-4480-be53-2cfe8a95b7e5"/>
+  </ds:schemaRefs>
+</ds:datastoreItem>
 </file>
 
-<file path=customXml/itemProps1.xml><?xml version="1.0" encoding="utf-8"?>
+<file path=customXml/itemProps2.xml><?xml version="1.0" encoding="utf-8"?>
 <ds:datastoreItem xmlns:ds="http://schemas.openxmlformats.org/officeDocument/2006/customXml" ds:itemID="{BE655D3F-A7EC-44D0-90E3-DF5EDE1ED3CF}">
   <ds:schemaRefs>
     <ds:schemaRef ds:uri="http://schemas.microsoft.com/sharepoint/v3/contenttype/forms"/>
@@ -1660,7 +1788,7 @@
 </ds:datastoreItem>
 </file>
 
-<file path=customXml/itemProps2.xml><?xml version="1.0" encoding="utf-8"?>
+<file path=customXml/itemProps3.xml><?xml version="1.0" encoding="utf-8"?>
 <ds:datastoreItem xmlns:ds="http://schemas.openxmlformats.org/officeDocument/2006/customXml" ds:itemID="{8A3FC927-AB79-45D8-AB7A-E4DA8FFC78A1}">
   <ds:schemaRefs>
     <ds:schemaRef ds:uri="http://schemas.microsoft.com/office/2006/metadata/contentType"/>
@@ -1676,14 +1804,4 @@
     <ds:schemaRef ds:uri="http://schemas.microsoft.com/internal/obd"/>
   </ds:schemaRefs>
 </ds:datastoreItem>
-</file>
-
-<file path=customXml/itemProps3.xml><?xml version="1.0" encoding="utf-8"?>
-<ds:datastoreItem xmlns:ds="http://schemas.openxmlformats.org/officeDocument/2006/customXml" ds:itemID="{29C4C59C-B683-41B1-841F-F70D1B5C7758}">
-  <ds:schemaRefs>
-    <ds:schemaRef ds:uri="http://schemas.microsoft.com/office/2006/metadata/properties"/>
-    <ds:schemaRef ds:uri="http://schemas.microsoft.com/office/infopath/2007/PartnerControls"/>
-    <ds:schemaRef ds:uri="642d3e23-7199-4480-be53-2cfe8a95b7e5"/>
-  </ds:schemaRefs>
-</ds:datastoreItem>
 </file>
</xml_diff>